<commit_message>
sast dast workspace implement
</commit_message>
<xml_diff>
--- a/QualityOps_Go_Live_Deployment_Guide.docx
+++ b/QualityOps_Go_Live_Deployment_Guide.docx
@@ -11,7 +11,7 @@
           <w:rFonts w:ascii="Aptos" w:hAnsi="Aptos"/>
           <w:b/>
           <w:i w:val="0"/>
-          <w:color w:val="245A92"/>
+          <w:color w:val="000000"/>
           <w:sz w:val="22"/>
         </w:rPr>
         <w:t>QUALITYOPS</w:t>
@@ -26,7 +26,7 @@
           <w:rFonts w:ascii="Aptos" w:hAnsi="Aptos"/>
           <w:b/>
           <w:i w:val="0"/>
-          <w:color w:val="173F6D"/>
+          <w:color w:val="000000"/>
           <w:sz w:val="56"/>
         </w:rPr>
         <w:t>Production Go-Live</w:t>
@@ -43,7 +43,7 @@
           <w:rFonts w:ascii="Aptos" w:hAnsi="Aptos"/>
           <w:b w:val="0"/>
           <w:i w:val="0"/>
-          <w:color w:val="60768A"/>
+          <w:color w:val="000000"/>
           <w:sz w:val="26"/>
         </w:rPr>
         <w:t>Controlled promotion from connected UAT to offline Production using Podman Compose</w:t>
@@ -166,19 +166,8 @@
             <w:vAlign w:val="center"/>
           </w:tcPr>
           <w:p>
-            <w:pPr>
-              <w:spacing w:before="0" w:after="0" w:line="252" w:lineRule="auto"/>
-              <w:jc w:val="left"/>
-            </w:pPr>
-            <w:r>
-              <w:rPr>
-                <w:rFonts w:ascii="Aptos" w:hAnsi="Aptos"/>
-                <w:b w:val="0"/>
-                <w:i w:val="0"/>
-                <w:color w:val="1F2937"/>
-                <w:sz w:val="17"/>
-              </w:rPr>
-              <w:t>1.0</w:t>
+            <w:r>
+              <w:t>1.1</w:t>
             </w:r>
           </w:p>
         </w:tc>
@@ -226,19 +215,8 @@
             <w:vAlign w:val="center"/>
           </w:tcPr>
           <w:p>
-            <w:pPr>
-              <w:spacing w:before="0" w:after="0" w:line="252" w:lineRule="auto"/>
-              <w:jc w:val="left"/>
-            </w:pPr>
-            <w:r>
-              <w:rPr>
-                <w:rFonts w:ascii="Aptos" w:hAnsi="Aptos"/>
-                <w:b w:val="0"/>
-                <w:i w:val="0"/>
-                <w:color w:val="1F2937"/>
-                <w:sz w:val="17"/>
-              </w:rPr>
-              <w:t>02 September 2026</w:t>
+            <w:r>
+              <w:t>16 September 2026</w:t>
             </w:r>
           </w:p>
         </w:tc>
@@ -690,6 +668,9 @@
         <w:pStyle w:val="Heading2"/>
       </w:pPr>
       <w:r>
+        <w:rPr>
+          <w:color w:val="000000"/>
+        </w:rPr>
         <w:t>Purpose</w:t>
       </w:r>
     </w:p>
@@ -713,6 +694,9 @@
         <w:pStyle w:val="Heading2"/>
       </w:pPr>
       <w:r>
+        <w:rPr>
+          <w:color w:val="000000"/>
+        </w:rPr>
         <w:t>Scope</w:t>
       </w:r>
     </w:p>
@@ -813,6 +797,9 @@
         <w:pStyle w:val="Heading1"/>
       </w:pPr>
       <w:r>
+        <w:rPr>
+          <w:color w:val="000000"/>
+        </w:rPr>
         <w:t>1. Deployment architecture</w:t>
       </w:r>
     </w:p>
@@ -901,6 +888,9 @@
         <w:pStyle w:val="Heading2"/>
       </w:pPr>
       <w:r>
+        <w:rPr>
+          <w:color w:val="000000"/>
+        </w:rPr>
         <w:t>How to read the deployment flow</w:t>
       </w:r>
     </w:p>
@@ -989,6 +979,9 @@
         <w:pStyle w:val="Heading2"/>
       </w:pPr>
       <w:r>
+        <w:rPr>
+          <w:color w:val="000000"/>
+        </w:rPr>
         <w:t>Runtime service map</w:t>
       </w:r>
     </w:p>
@@ -1721,6 +1714,9 @@
         <w:pStyle w:val="Heading1"/>
       </w:pPr>
       <w:r>
+        <w:rPr>
+          <w:color w:val="000000"/>
+        </w:rPr>
         <w:t>2. Governance, roles and release gates</w:t>
       </w:r>
     </w:p>
@@ -1729,6 +1725,9 @@
         <w:pStyle w:val="Heading2"/>
       </w:pPr>
       <w:r>
+        <w:rPr>
+          <w:color w:val="000000"/>
+        </w:rPr>
         <w:t>Required roles</w:t>
       </w:r>
     </w:p>
@@ -2374,6 +2373,9 @@
         <w:pStyle w:val="Heading2"/>
       </w:pPr>
       <w:r>
+        <w:rPr>
+          <w:color w:val="000000"/>
+        </w:rPr>
         <w:t>Go/no-go gates</w:t>
       </w:r>
     </w:p>
@@ -3106,6 +3108,9 @@
         <w:pStyle w:val="Heading1"/>
       </w:pPr>
       <w:r>
+        <w:rPr>
+          <w:color w:val="000000"/>
+        </w:rPr>
         <w:t>3. Pre-deployment prerequisites</w:t>
       </w:r>
     </w:p>
@@ -3114,6 +3119,9 @@
         <w:pStyle w:val="Heading2"/>
       </w:pPr>
       <w:r>
+        <w:rPr>
+          <w:color w:val="000000"/>
+        </w:rPr>
         <w:t>UAT build host</w:t>
       </w:r>
     </w:p>
@@ -3194,7 +3202,7 @@
           <w:color w:val="1F2937"/>
           <w:sz w:val="21"/>
         </w:rPr>
-        <w:t>A unique immutable release tag agreed, for example `2026.09.02-1`; do not promote only `latest`.</w:t>
+        <w:t>A unique immutable release tag agreed, for example `2026.09.16-1`; do not promote only `latest`.</w:t>
       </w:r>
     </w:p>
     <w:p>
@@ -3202,6 +3210,9 @@
         <w:pStyle w:val="Heading2"/>
       </w:pPr>
       <w:r>
+        <w:rPr>
+          <w:color w:val="000000"/>
+        </w:rPr>
         <w:t>Production host</w:t>
       </w:r>
     </w:p>
@@ -3310,6 +3321,9 @@
         <w:pStyle w:val="Heading2"/>
       </w:pPr>
       <w:r>
+        <w:rPr>
+          <w:color w:val="000000"/>
+        </w:rPr>
         <w:t>Required Production directories</w:t>
       </w:r>
     </w:p>
@@ -3714,7 +3728,7 @@
                 <w:color w:val="1F2937"/>
                 <w:sz w:val="17"/>
               </w:rPr>
-              <w:t>2026.09.02-1</w:t>
+              <w:t>2026.09.16-1</w:t>
             </w:r>
           </w:p>
         </w:tc>
@@ -4085,6 +4099,9 @@
         <w:pStyle w:val="Heading1"/>
       </w:pPr>
       <w:r>
+        <w:rPr>
+          <w:color w:val="000000"/>
+        </w:rPr>
         <w:t>4. UAT build, test and release packaging</w:t>
       </w:r>
     </w:p>
@@ -4093,6 +4110,9 @@
         <w:pStyle w:val="Heading2"/>
       </w:pPr>
       <w:r>
+        <w:rPr>
+          <w:color w:val="000000"/>
+        </w:rPr>
         <w:t>4.1 Set the immutable release tag</w:t>
       </w:r>
     </w:p>
@@ -4110,8 +4130,9 @@
           <w:color w:val="1F2937"/>
           <w:sz w:val="16"/>
         </w:rPr>
-        <w:t>export IMAGE_TAG=2026.09.02-1</w:t>
+        <w:t>export IMAGE_TAG=2026.09.16-1</w:t>
         <w:br/>
+        <w:t>podman-compose -p qualityops --env-file .env.uat config</w:t>
       </w:r>
       <w:r>
         <w:rPr>
@@ -4121,7 +4142,6 @@
           <w:color w:val="1F2937"/>
           <w:sz w:val="16"/>
         </w:rPr>
-        <w:t>podman-compose -p qualityops --env-file .env.uat config</w:t>
       </w:r>
     </w:p>
     <w:tbl>
@@ -4211,6 +4231,9 @@
         <w:pStyle w:val="Heading2"/>
       </w:pPr>
       <w:r>
+        <w:rPr>
+          <w:color w:val="000000"/>
+        </w:rPr>
         <w:t>4.2 Build the application images</w:t>
       </w:r>
     </w:p>
@@ -4273,6 +4296,9 @@
         <w:pStyle w:val="Heading2"/>
       </w:pPr>
       <w:r>
+        <w:rPr>
+          <w:color w:val="000000"/>
+        </w:rPr>
         <w:t>4.3 Run UAT and record acceptance</w:t>
       </w:r>
     </w:p>
@@ -4380,6 +4406,9 @@
         <w:pStyle w:val="Heading2"/>
       </w:pPr>
       <w:r>
+        <w:rPr>
+          <w:color w:val="000000"/>
+        </w:rPr>
         <w:t>4.4 Package the approved runtime images</w:t>
       </w:r>
     </w:p>
@@ -4469,6 +4498,9 @@
         <w:pStyle w:val="Heading1"/>
       </w:pPr>
       <w:r>
+        <w:rPr>
+          <w:color w:val="000000"/>
+        </w:rPr>
         <w:t>5. Production preflight and artifact loading</w:t>
       </w:r>
     </w:p>
@@ -4477,6 +4509,9 @@
         <w:pStyle w:val="Heading2"/>
       </w:pPr>
       <w:r>
+        <w:rPr>
+          <w:color w:val="000000"/>
+        </w:rPr>
         <w:t>5.1 Verify transferred artifacts</w:t>
       </w:r>
     </w:p>
@@ -4546,6 +4581,9 @@
         <w:pStyle w:val="Heading2"/>
       </w:pPr>
       <w:r>
+        <w:rPr>
+          <w:color w:val="000000"/>
+        </w:rPr>
         <w:t>5.2 Validate protected configuration</w:t>
       </w:r>
     </w:p>
@@ -5185,6 +5223,9 @@
         <w:pStyle w:val="Heading1"/>
       </w:pPr>
       <w:r>
+        <w:rPr>
+          <w:color w:val="000000"/>
+        </w:rPr>
         <w:t>6. Production deployment execution</w:t>
       </w:r>
     </w:p>
@@ -5193,6 +5234,9 @@
         <w:pStyle w:val="Heading2"/>
       </w:pPr>
       <w:r>
+        <w:rPr>
+          <w:color w:val="000000"/>
+        </w:rPr>
         <w:t>6.1 Start the controlled stack</w:t>
       </w:r>
     </w:p>
@@ -5210,8 +5254,11 @@
           <w:color w:val="1F2937"/>
           <w:sz w:val="16"/>
         </w:rPr>
-        <w:t>export IMAGE_TAG=2026.09.02-1</w:t>
+        <w:t>export IMAGE_TAG=2026.09.16-1</w:t>
         <w:br/>
+        <w:t>podman-compose -p qualityops --env-file .env.prod \</w:t>
+        <w:br/>
+        <w:t xml:space="preserve">  up -d --no-build --pull never</w:t>
       </w:r>
       <w:r>
         <w:rPr>
@@ -5221,8 +5268,6 @@
           <w:color w:val="1F2937"/>
           <w:sz w:val="16"/>
         </w:rPr>
-        <w:t>podman-compose -p qualityops --env-file .env.prod \</w:t>
-        <w:br/>
       </w:r>
       <w:r>
         <w:rPr>
@@ -5232,7 +5277,6 @@
           <w:color w:val="1F2937"/>
           <w:sz w:val="16"/>
         </w:rPr>
-        <w:t xml:space="preserve">  up -d --no-build --pull never</w:t>
       </w:r>
     </w:p>
     <w:p>
@@ -5255,6 +5299,9 @@
         <w:pStyle w:val="Heading2"/>
       </w:pPr>
       <w:r>
+        <w:rPr>
+          <w:color w:val="000000"/>
+        </w:rPr>
         <w:t>6.2 Expected orchestration sequence</w:t>
       </w:r>
     </w:p>
@@ -5983,6 +6030,9 @@
         <w:pStyle w:val="Heading2"/>
       </w:pPr>
       <w:r>
+        <w:rPr>
+          <w:color w:val="000000"/>
+        </w:rPr>
         <w:t>6.3 Observe startup</w:t>
       </w:r>
     </w:p>
@@ -6117,6 +6167,9 @@
         <w:pStyle w:val="Heading1"/>
       </w:pPr>
       <w:r>
+        <w:rPr>
+          <w:color w:val="000000"/>
+        </w:rPr>
         <w:t>7. Technical and business validation</w:t>
       </w:r>
     </w:p>
@@ -6125,6 +6178,9 @@
         <w:pStyle w:val="Heading2"/>
       </w:pPr>
       <w:r>
+        <w:rPr>
+          <w:color w:val="000000"/>
+        </w:rPr>
         <w:t>7.1 Technical checks</w:t>
       </w:r>
     </w:p>
@@ -7021,6 +7077,9 @@
         <w:pStyle w:val="Heading2"/>
       </w:pPr>
       <w:r>
+        <w:rPr>
+          <w:color w:val="000000"/>
+        </w:rPr>
         <w:t>7.2 Business smoke tests</w:t>
       </w:r>
     </w:p>
@@ -8068,6 +8127,9 @@
         <w:pStyle w:val="Heading1"/>
       </w:pPr>
       <w:r>
+        <w:rPr>
+          <w:color w:val="000000"/>
+        </w:rPr>
         <w:t>8. Troubleshooting decision guide</w:t>
       </w:r>
     </w:p>
@@ -8974,6 +9036,9 @@
         <w:pStyle w:val="Heading2"/>
       </w:pPr>
       <w:r>
+        <w:rPr>
+          <w:color w:val="000000"/>
+        </w:rPr>
         <w:t>Evidence-preserving diagnostics</w:t>
       </w:r>
     </w:p>
@@ -9052,6 +9117,9 @@
         <w:pStyle w:val="Heading1"/>
       </w:pPr>
       <w:r>
+        <w:rPr>
+          <w:color w:val="000000"/>
+        </w:rPr>
         <w:t>9. Rollback and recovery</w:t>
       </w:r>
     </w:p>
@@ -9060,6 +9128,9 @@
         <w:pStyle w:val="Heading2"/>
       </w:pPr>
       <w:r>
+        <w:rPr>
+          <w:color w:val="000000"/>
+        </w:rPr>
         <w:t>Rollback decision triggers</w:t>
       </w:r>
     </w:p>
@@ -9148,6 +9219,9 @@
         <w:pStyle w:val="Heading2"/>
       </w:pPr>
       <w:r>
+        <w:rPr>
+          <w:color w:val="000000"/>
+        </w:rPr>
         <w:t>Application-image rollback</w:t>
       </w:r>
     </w:p>
@@ -9232,6 +9306,9 @@
         <w:pStyle w:val="Heading2"/>
       </w:pPr>
       <w:r>
+        <w:rPr>
+          <w:color w:val="000000"/>
+        </w:rPr>
         <w:t>Database rollback</w:t>
       </w:r>
     </w:p>
@@ -9422,6 +9499,9 @@
         <w:pStyle w:val="Heading2"/>
       </w:pPr>
       <w:r>
+        <w:rPr>
+          <w:color w:val="000000"/>
+        </w:rPr>
         <w:t>Rollback outcome record</w:t>
       </w:r>
     </w:p>
@@ -9871,6 +9951,9 @@
         <w:pStyle w:val="Heading1"/>
       </w:pPr>
       <w:r>
+        <w:rPr>
+          <w:color w:val="000000"/>
+        </w:rPr>
         <w:t>10. Go-live execution checklist</w:t>
       </w:r>
     </w:p>
@@ -11877,6 +11960,9 @@
         <w:pStyle w:val="Heading2"/>
       </w:pPr>
       <w:r>
+        <w:rPr>
+          <w:color w:val="000000"/>
+        </w:rPr>
         <w:t>Final authorization</w:t>
       </w:r>
     </w:p>
@@ -12378,6 +12464,499 @@
         <w:pStyle w:val="Heading1"/>
       </w:pPr>
       <w:r>
+        <w:rPr>
+          <w:color w:val="000000"/>
+        </w:rPr>
+        <w:t>11 Current release operational requirements</w:t>
+      </w:r>
+    </w:p>
+    <w:p>
+      <w:pPr/>
+      <w:r>
+        <w:t>These checks supplement the deployment sequence and are required for UAT acceptance of this release. Record Production-specific endpoints, integration results, migration evidence and accountable owners in the release record. They do not indicate that deployment has already been approved.</w:t>
+      </w:r>
+    </w:p>
+    <w:p>
+      <w:pPr>
+        <w:pStyle w:val="Heading2"/>
+      </w:pPr>
+      <w:r>
+        <w:rPr>
+          <w:color w:val="000000"/>
+        </w:rPr>
+        <w:t>Security migrations and deployment order</w:t>
+      </w:r>
+    </w:p>
+    <w:p>
+      <w:pPr/>
+      <w:r>
+        <w:t>The release migration head is c52a8e1f7d30 as of 16 September 2026. Run alembic upgrade head before either API starts and record alembic current. Revision b31f7a9c2d64 adds security scan target snapshots; c52a8e1f7d30 adds the execution_key column used to group independent target imports from one scan action.</w:t>
+      </w:r>
+    </w:p>
+    <w:p>
+      <w:pPr/>
+      <w:r>
+        <w:t>Oracle ORA-00904 for QAP_SECURITY_SCAN_RESULTS.EXECUTION_KEY indicates a schema and application version mismatch. Stop promotion, inspect the migration output and apply the reviewed migration chain. Do not use alembic stamp to hide a missing column. Legacy scan records may have no execution key or target snapshot; retain their evidence rather than inventing historical target identity.</w:t>
+      </w:r>
+    </w:p>
+    <w:p>
+      <w:pPr>
+        <w:pStyle w:val="Heading2"/>
+      </w:pPr>
+      <w:r>
+        <w:rPr>
+          <w:color w:val="000000"/>
+        </w:rPr>
+        <w:t>Independent scans and selective rescans</w:t>
+      </w:r>
+    </w:p>
+    <w:p>
+      <w:pPr/>
+      <w:r>
+        <w:t>Each configured SAST repository or DAST application URL is scanned independently. Initial Scan requires a processed Fortify application and version result for every configured target. The import is atomic: a target import failure prevents partial results from being saved.</w:t>
+      </w:r>
+    </w:p>
+    <w:p>
+      <w:pPr/>
+      <w:r>
+        <w:t>Rescan imports only targets with findings still pending or no captured result. A clear target keeps its previous scan evidence and does not receive a new scan history entry. All pending targets must be supplied. Dashboards and reports use the latest captured result for each target, including clear results retained from earlier actions.</w:t>
+      </w:r>
+    </w:p>
+    <w:p>
+      <w:pPr/>
+      <w:r>
+        <w:t>Findings displays initial and current results together for each target, paired by target ID. Fortify filter views such as Security Auditor View and Quick View can overlap and must not be added together. Current suppressed counts are shown separately. Scan History is expandable and records import timestamps in IST.</w:t>
+      </w:r>
+    </w:p>
+    <w:p>
+      <w:pPr>
+        <w:pStyle w:val="Heading2"/>
+      </w:pPr>
+      <w:r>
+        <w:rPr>
+          <w:color w:val="000000"/>
+        </w:rPr>
+        <w:t>Fix evidence and suppression rules</w:t>
+      </w:r>
+    </w:p>
+    <w:p>
+      <w:pPr/>
+      <w:r>
+        <w:t>When the requester or active delegated developer selects Mark Fixed, a latest commit ID or hash is mandatory for every target still requiring remediation. SAST updates the repository commit reference and records prior and new references in workflow history. DAST records the deployed commit or artifact hash against each affected application URL in workflow history. Clear targets are excluded from this form.</w:t>
+      </w:r>
+    </w:p>
+    <w:p>
+      <w:pPr/>
+      <w:r>
+        <w:t>A suppression request can contain multiple finding items. One SAST or DAST request cannot create or link another suppression while an existing suppression is Draft, pending or Done. A Rejected suppression allows a fresh request. Multiple linked historical records can exist; this is not permission to create multiple active requests. Pending suppression decisions block Mark Fixed. An approved suppression alone does not clear Fortify findings; the required rescan must confirm the current result.</w:t>
+      </w:r>
+    </w:p>
+    <w:p>
+      <w:pPr>
+        <w:pStyle w:val="Heading2"/>
+      </w:pPr>
+      <w:r>
+        <w:rPr>
+          <w:color w:val="000000"/>
+        </w:rPr>
+        <w:t>Authorization and workspace acceptance</w:t>
+      </w:r>
+    </w:p>
+    <w:p>
+      <w:pPr/>
+      <w:r>
+        <w:t>Use approved Production identities and disable LDAP mock authentication. System Administrator privileges allow administration across workspaces; workflow participation additionally requires the appropriate business role and is restricted to the administrator home department. Administrator status alone must not make a user an eligible tester, resolver or approver.</w:t>
+      </w:r>
+      <w:r>
+        <w:t xml:space="preserve"> Production LDAP requires LDAP_SERVER_URI with LDAPS, LDAP_USE_SSL=true, and either search-then-bind settings or LDAP_USER_DN_TEMPLATE. Configure LDAP_CA_CERTS_FILE when required and verify the CA file is mounted and readable in the API container; certificate validation remains enabled.</w:t>
+      </w:r>
+    </w:p>
+    <w:p>
+      <w:pPr/>
+      <w:r>
+        <w:t>Scale 6+ provides read-only visibility across workspaces. A Parent Workspace Viewer is a workspace access relationship, not a substitute for a business role. For shared Test Projects, authorized users in the receiving workspace can create and execute their own workspace records; records owned by other workspaces remain read-only.</w:t>
+      </w:r>
+    </w:p>
+    <w:p>
+      <w:pPr/>
+      <w:r>
+        <w:t>Validate eligible user pickers and pending notifications against role, home department, selected department and workspace access. Suppression Drafts remain private to their creator and authorized administrator. Test the creator list and detail access as well as noncreator list and direct-link denial.</w:t>
+      </w:r>
+    </w:p>
+    <w:p>
+      <w:pPr>
+        <w:pStyle w:val="Heading2"/>
+      </w:pPr>
+      <w:r>
+        <w:rPr>
+          <w:color w:val="000000"/>
+        </w:rPr>
+        <w:t>Execution and QA clearance acceptance</w:t>
+      </w:r>
+    </w:p>
+    <w:p>
+      <w:pPr/>
+      <w:r>
+        <w:t>A linked Functional Request must be Execution In Progress before its Test Cycle can start or record execution. The cycle must also satisfy its own start state, environment and tested-build requirements. Functional QA completion requires every linked cycle to be Completed. Cycle completion validates the latest execution results and linked defect evidence; a cycle with unresolved failed or blocked results must not be accepted as complete.</w:t>
+      </w:r>
+    </w:p>
+    <w:p>
+      <w:pPr/>
+      <w:r>
+        <w:t>Retest eligibility checks defect verification against the cycle environment and tested build. Use the actual build identifier; do not substitute a placeholder to bypass verification. Completed cycles remain read-only and any authorized data correction must preserve prior history and add an audit explanation.</w:t>
+      </w:r>
+    </w:p>
+    <w:p>
+      <w:pPr/>
+      <w:r>
+        <w:t>QA clearance cannot be raised while related SAST or DAST work from the same parent QA Request is not Closed. Certificate evidence is frozen at a captured revision. Refresh summaries invalidates previous approvals and restarts approval; a rejected certificate must first be reopened. Assigned Tester names, CR or EPIC number, change description and execution and defect summaries are included in the evidence.</w:t>
+      </w:r>
+    </w:p>
+    <w:p>
+      <w:pPr/>
+      <w:r>
+        <w:t>Section E contains Testing Scope Completed, Open Risks, Known Limitations, Business Acceptance Status, Security Testing Status, Deployment Recommendation and Remarks. Section F is shown only for Conditional Clearance. User-entered conditional observations are used as entered; when blank, the system generates observations from linked evidence. Deferred defects remain open in certificate summaries.</w:t>
+      </w:r>
+    </w:p>
+    <w:p>
+      <w:pPr>
+        <w:pStyle w:val="Heading2"/>
+      </w:pPr>
+      <w:r>
+        <w:rPr>
+          <w:color w:val="000000"/>
+        </w:rPr>
+        <w:t>Document storage and reporting acceptance</w:t>
+      </w:r>
+    </w:p>
+    <w:p>
+      <w:pPr/>
+      <w:r>
+        <w:t>Every Document Portal workspace has a root folder named after the workspace. No default storage quota is granted: an administrator must configure the limit in Workspace settings before users consume storage. Child workspace data stays under the child root but is constrained by the parent storage budget. Verify limits at each applicable ancestor, concurrent upload handling and remaining capacity before go-live.</w:t>
+      </w:r>
+    </w:p>
+    <w:p>
+      <w:pPr/>
+      <w:r>
+        <w:t>Back up Oracle metadata, module uploads, Document Portal repository and retained configuration together. Keep temporary work storage separate from persistent evidence. An application rollback must not remove or rename existing storage mounts or volume keys.</w:t>
+      </w:r>
+    </w:p>
+    <w:p>
+      <w:pPr/>
+      <w:r>
+        <w:t>Validate organized workspace reports for requests and status, testcase inventory, cycle execution, defects and traceability gaps. Each Test Reports catalogue entry has an export action. Verify user access audit export includes role and workspace access, and report totals distinguish parent QA Requests from their child workflows.</w:t>
+      </w:r>
+    </w:p>
+    <w:p>
+      <w:pPr>
+        <w:pStyle w:val="Heading2"/>
+      </w:pPr>
+      <w:r>
+        <w:rPr>
+          <w:color w:val="000000"/>
+        </w:rPr>
+        <w:t>SMTP and SLA operational checks</w:t>
+      </w:r>
+    </w:p>
+    <w:p>
+      <w:pPr/>
+      <w:r>
+        <w:t>SMTP is disabled unless SMTP_ENABLED=true. Set the approved SMTP_HOST, SMTP_PORT, SMTP_FROM_ADDRESS, optional SMTP_USERNAME and SMTP_PASSWORD, and PORTAL_BASE_URL for Production links. Select either SMTP_STARTTLS or SMTP_SSL, never both. Supply SMTP_CA_CERTS_FILE where the bank relay uses a private CA and make that path readable inside the core API container.</w:t>
+      </w:r>
+    </w:p>
+    <w:p>
+      <w:pPr/>
+      <w:r>
+        <w:t>Workflow, assignment and approval messages use the durable qap_email_notifications outbox with retry state. Verify actual mailbox delivery to the eligible assignee or responsible approval group for Functional, SAST, DAST, Suppression, Defect and Test Lifecycle events. An outbox row alone is not proof of delivered mail.</w:t>
+      </w:r>
+    </w:p>
+    <w:p>
+      <w:pPr/>
+      <w:r>
+        <w:t>The current SLA worker follows the dashboard calendar-day breach threshold: more than 15 elapsed days since the record last update, provided an actionable pending route exists. It sends to the responsible recipients and their eligible department heads. It queues one notice per unchanged status and update timestamp. The dashboard 3 to 5 day bands do not configure separate stage SLA reminders; no business-hour calculation or periodic repeated breach reminder is implemented.</w:t>
+      </w:r>
+    </w:p>
+    <w:tbl>
+      <w:tblPr>
+        <w:tblStyle w:val="TableGrid"/>
+        <w:tblW w:type="auto" w:w="0"/>
+        <w:tblLook w:firstColumn="1" w:firstRow="1" w:lastColumn="0" w:lastRow="0" w:noHBand="0" w:noVBand="1" w:val="04A0"/>
+      </w:tblPr>
+      <w:tblGrid>
+        <w:gridCol w:w="4680"/>
+        <w:gridCol w:w="4680"/>
+      </w:tblGrid>
+      <w:tr>
+        <w:trPr>
+          <w:tblHeader/>
+        </w:trPr>
+        <w:tc>
+          <w:tcPr>
+            <w:tcW w:type="dxa" w:w="4680"/>
+            <w:shd w:fill="E7EDF3"/>
+          </w:tcPr>
+          <w:p>
+            <w:r>
+              <w:rPr>
+                <w:b/>
+                <w:color w:val="000000"/>
+                <w:sz w:val="18"/>
+              </w:rPr>
+              <w:t>Check</w:t>
+            </w:r>
+          </w:p>
+        </w:tc>
+        <w:tc>
+          <w:tcPr>
+            <w:tcW w:type="dxa" w:w="4680"/>
+            <w:shd w:fill="E7EDF3"/>
+          </w:tcPr>
+          <w:p>
+            <w:r>
+              <w:rPr>
+                <w:b/>
+                <w:color w:val="000000"/>
+                <w:sz w:val="18"/>
+              </w:rPr>
+              <w:t>Required evidence</w:t>
+            </w:r>
+          </w:p>
+        </w:tc>
+      </w:tr>
+      <w:tr>
+        <w:tc>
+          <w:tcPr>
+            <w:tcW w:type="dxa" w:w="4680"/>
+          </w:tcPr>
+          <w:p>
+            <w:r>
+              <w:rPr>
+                <w:sz w:val="18"/>
+              </w:rPr>
+              <w:t>Two target initial scan</w:t>
+            </w:r>
+          </w:p>
+        </w:tc>
+        <w:tc>
+          <w:tcPr>
+            <w:tcW w:type="dxa" w:w="4680"/>
+          </w:tcPr>
+          <w:p>
+            <w:r>
+              <w:rPr>
+                <w:sz w:val="18"/>
+              </w:rPr>
+              <w:t>Both targets captured independently; counts and Fortify view titles match SSC.</w:t>
+            </w:r>
+          </w:p>
+        </w:tc>
+      </w:tr>
+      <w:tr>
+        <w:tc>
+          <w:tcPr>
+            <w:tcW w:type="dxa" w:w="4680"/>
+          </w:tcPr>
+          <w:p>
+            <w:r>
+              <w:rPr>
+                <w:sz w:val="18"/>
+              </w:rPr>
+              <w:t>Partial rescan</w:t>
+            </w:r>
+          </w:p>
+        </w:tc>
+        <w:tc>
+          <w:tcPr>
+            <w:tcW w:type="dxa" w:w="4680"/>
+          </w:tcPr>
+          <w:p>
+            <w:r>
+              <w:rPr>
+                <w:sz w:val="18"/>
+              </w:rPr>
+              <w:t>Only the target with pending findings gets a new import; clear target values and history remain unchanged.</w:t>
+            </w:r>
+          </w:p>
+        </w:tc>
+      </w:tr>
+      <w:tr>
+        <w:tc>
+          <w:tcPr>
+            <w:tcW w:type="dxa" w:w="4680"/>
+          </w:tcPr>
+          <w:p>
+            <w:r>
+              <w:rPr>
+                <w:sz w:val="18"/>
+              </w:rPr>
+              <w:t>Mark Fixed</w:t>
+            </w:r>
+          </w:p>
+        </w:tc>
+        <w:tc>
+          <w:tcPr>
+            <w:tcW w:type="dxa" w:w="4680"/>
+          </w:tcPr>
+          <w:p>
+            <w:r>
+              <w:rPr>
+                <w:sz w:val="18"/>
+              </w:rPr>
+              <w:t>Missing commit or hash is rejected; each pending target reference and actor appear in history.</w:t>
+            </w:r>
+          </w:p>
+        </w:tc>
+      </w:tr>
+      <w:tr>
+        <w:tc>
+          <w:tcPr>
+            <w:tcW w:type="dxa" w:w="4680"/>
+          </w:tcPr>
+          <w:p>
+            <w:r>
+              <w:rPr>
+                <w:sz w:val="18"/>
+              </w:rPr>
+              <w:t>Suppression</w:t>
+            </w:r>
+          </w:p>
+        </w:tc>
+        <w:tc>
+          <w:tcPr>
+            <w:tcW w:type="dxa" w:w="4680"/>
+          </w:tcPr>
+          <w:p>
+            <w:r>
+              <w:rPr>
+                <w:sz w:val="18"/>
+              </w:rPr>
+              <w:t>Multiple items allowed; duplicate active or approved request blocked; rejection allows a new request.</w:t>
+            </w:r>
+          </w:p>
+        </w:tc>
+      </w:tr>
+      <w:tr>
+        <w:tc>
+          <w:tcPr>
+            <w:tcW w:type="dxa" w:w="4680"/>
+          </w:tcPr>
+          <w:p>
+            <w:r>
+              <w:rPr>
+                <w:sz w:val="18"/>
+              </w:rPr>
+              <w:t>Roles and workflow</w:t>
+            </w:r>
+          </w:p>
+        </w:tc>
+        <w:tc>
+          <w:tcPr>
+            <w:tcW w:type="dxa" w:w="4680"/>
+          </w:tcPr>
+          <w:p>
+            <w:r>
+              <w:rPr>
+                <w:sz w:val="18"/>
+              </w:rPr>
+              <w:t>Correct QA users appear; wrong-department admin excluded; Scale 6+ writes rejected.</w:t>
+            </w:r>
+          </w:p>
+        </w:tc>
+      </w:tr>
+      <w:tr>
+        <w:tc>
+          <w:tcPr>
+            <w:tcW w:type="dxa" w:w="4680"/>
+          </w:tcPr>
+          <w:p>
+            <w:r>
+              <w:rPr>
+                <w:sz w:val="18"/>
+              </w:rPr>
+              <w:t>Cycle and certificate gates</w:t>
+            </w:r>
+          </w:p>
+        </w:tc>
+        <w:tc>
+          <w:tcPr>
+            <w:tcW w:type="dxa" w:w="4680"/>
+          </w:tcPr>
+          <w:p>
+            <w:r>
+              <w:rPr>
+                <w:sz w:val="18"/>
+              </w:rPr>
+              <w:t>Linked request start state, failure and defect verification, security closure and rejected refresh gates enforced.</w:t>
+            </w:r>
+          </w:p>
+        </w:tc>
+      </w:tr>
+      <w:tr>
+        <w:tc>
+          <w:tcPr>
+            <w:tcW w:type="dxa" w:w="4680"/>
+          </w:tcPr>
+          <w:p>
+            <w:r>
+              <w:rPr>
+                <w:sz w:val="18"/>
+              </w:rPr>
+              <w:t>Storage and exports</w:t>
+            </w:r>
+          </w:p>
+        </w:tc>
+        <w:tc>
+          <w:tcPr>
+            <w:tcW w:type="dxa" w:w="4680"/>
+          </w:tcPr>
+          <w:p>
+            <w:r>
+              <w:rPr>
+                <w:sz w:val="18"/>
+              </w:rPr>
+              <w:t>Workspace root, administrator quota, child budget and report and access exports verified.</w:t>
+            </w:r>
+          </w:p>
+        </w:tc>
+      </w:tr>
+      <w:tr>
+        <w:tc>
+          <w:tcPr>
+            <w:tcW w:type="dxa" w:w="4680"/>
+          </w:tcPr>
+          <w:p>
+            <w:r>
+              <w:rPr>
+                <w:sz w:val="18"/>
+              </w:rPr>
+              <w:t>Mail and breach</w:t>
+            </w:r>
+          </w:p>
+        </w:tc>
+        <w:tc>
+          <w:tcPr>
+            <w:tcW w:type="dxa" w:w="4680"/>
+          </w:tcPr>
+          <w:p>
+            <w:r>
+              <w:rPr>
+                <w:sz w:val="18"/>
+              </w:rPr>
+              <w:t>Mailbox receipt by actual assignee or approval group and eligible department heads; retry and deduplication verified.</w:t>
+            </w:r>
+          </w:p>
+        </w:tc>
+      </w:tr>
+    </w:tbl>
+    <w:p>
+      <w:pPr>
+        <w:pStyle w:val="Heading1"/>
+        <w:pageBreakBefore/>
+      </w:pPr>
+      <w:r>
+        <w:rPr>
+          <w:color w:val="000000"/>
+        </w:rPr>
         <w:t>Appendix A — Command quick reference</w:t>
       </w:r>
     </w:p>
@@ -12386,6 +12965,9 @@
         <w:pStyle w:val="Heading2"/>
       </w:pPr>
       <w:r>
+        <w:rPr>
+          <w:color w:val="000000"/>
+        </w:rPr>
         <w:t>UAT</w:t>
       </w:r>
     </w:p>
@@ -12499,6 +13081,9 @@
         <w:pStyle w:val="Heading2"/>
       </w:pPr>
       <w:r>
+        <w:rPr>
+          <w:color w:val="000000"/>
+        </w:rPr>
         <w:t>Production</w:t>
       </w:r>
     </w:p>
@@ -12590,6 +13175,9 @@
         <w:pStyle w:val="Heading1"/>
       </w:pPr>
       <w:r>
+        <w:rPr>
+          <w:color w:val="000000"/>
+        </w:rPr>
         <w:t>Appendix B — Artifact naming convention</w:t>
       </w:r>
     </w:p>
@@ -12780,7 +13368,7 @@
                 <w:color w:val="1F2937"/>
                 <w:sz w:val="17"/>
               </w:rPr>
-              <w:t>localhost/qualityops-backend:2026.09.02-1</w:t>
+              <w:t>localhost/qualityops-backend:2026.09.16-1</w:t>
             </w:r>
           </w:p>
         </w:tc>
@@ -12869,7 +13457,7 @@
                 <w:color w:val="1F2937"/>
                 <w:sz w:val="17"/>
               </w:rPr>
-              <w:t>localhost/qualityops-frontend:2026.09.02-1</w:t>
+              <w:t>localhost/qualityops-frontend:2026.09.16-1</w:t>
             </w:r>
           </w:p>
         </w:tc>
@@ -13044,7 +13632,7 @@
                 <w:color w:val="1F2937"/>
                 <w:sz w:val="17"/>
               </w:rPr>
-              <w:t>qualityops-release-2026.09.02-1.tar</w:t>
+              <w:t>qualityops-release-2026.09.16-1.tar</w:t>
             </w:r>
           </w:p>
         </w:tc>
@@ -13130,7 +13718,7 @@
                 <w:color w:val="1F2937"/>
                 <w:sz w:val="17"/>
               </w:rPr>
-              <w:t>qualityops-release-2026.09.02-1.tar.sha256</w:t>
+              <w:t>qualityops-release-2026.09.16-1.tar.sha256</w:t>
             </w:r>
           </w:p>
         </w:tc>
@@ -13925,7 +14513,7 @@
       <w:rFonts w:asciiTheme="majorHAnsi" w:eastAsiaTheme="majorEastAsia" w:hAnsiTheme="majorHAnsi" w:cstheme="majorBidi" w:ascii="Aptos" w:hAnsi="Aptos"/>
       <w:b/>
       <w:bCs/>
-      <w:color w:val="245A92"/>
+      <w:color w:val="000000"/>
       <w:sz w:val="32"/>
       <w:szCs w:val="28"/>
     </w:rPr>
@@ -13949,7 +14537,7 @@
       <w:rFonts w:asciiTheme="majorHAnsi" w:eastAsiaTheme="majorEastAsia" w:hAnsiTheme="majorHAnsi" w:cstheme="majorBidi" w:ascii="Aptos" w:hAnsi="Aptos"/>
       <w:b/>
       <w:bCs/>
-      <w:color w:val="245A92"/>
+      <w:color w:val="000000"/>
       <w:sz w:val="26"/>
       <w:szCs w:val="26"/>
     </w:rPr>
@@ -13973,7 +14561,7 @@
       <w:rFonts w:asciiTheme="majorHAnsi" w:eastAsiaTheme="majorEastAsia" w:hAnsiTheme="majorHAnsi" w:cstheme="majorBidi" w:ascii="Aptos" w:hAnsi="Aptos"/>
       <w:b/>
       <w:bCs/>
-      <w:color w:val="173F6D"/>
+      <w:color w:val="000000"/>
       <w:sz w:val="23"/>
     </w:rPr>
   </w:style>
@@ -14213,7 +14801,7 @@
     </w:pPr>
     <w:rPr>
       <w:rFonts w:asciiTheme="majorHAnsi" w:eastAsiaTheme="majorEastAsia" w:hAnsiTheme="majorHAnsi" w:cstheme="majorBidi"/>
-      <w:color w:val="17365D" w:themeColor="text2" w:themeShade="BF"/>
+      <w:color w:val="000000"/>
       <w:spacing w:val="5"/>
       <w:kern w:val="28"/>
       <w:sz w:val="52"/>
@@ -14252,7 +14840,7 @@
       <w:rFonts w:asciiTheme="majorHAnsi" w:eastAsiaTheme="majorEastAsia" w:hAnsiTheme="majorHAnsi" w:cstheme="majorBidi"/>
       <w:i/>
       <w:iCs/>
-      <w:color w:val="4F81BD" w:themeColor="accent1"/>
+      <w:color w:val="000000"/>
       <w:spacing w:val="15"/>
       <w:sz w:val="24"/>
       <w:szCs w:val="24"/>

</xml_diff>